<commit_message>
Update ENGL 1102-01 Unit 2 assignment: replace Scribbr with fifth topic-specific source (Alquran & Banitaan, 2026), fix hypothesis time-bound wording, note Kazemitabaar sample population
</commit_message>
<xml_diff>
--- a/Term_02/ENGL 1102-01 English Composition 2 - AY2027-T1/Assignments/Unit2_Assignment.docx
+++ b/Term_02/ENGL 1102-01 English Composition 2 - AY2027-T1/Assignments/Unit2_Assignment.docx
@@ -148,7 +148,7 @@
           <w:b w:val="0"/>
           <w:sz w:val="24"/>
         </w:rPr>
-        <w:t>Undergraduate computer science students who use an AI coding assistant, such as GitHub Copilot, on at least three introductory programming assignments will complete those assignments in less time than students who skip such tools, but will score lower on a follow-up assessment testing their understanding of the underlying concepts without AI assistance.</w:t>
+        <w:t>During one semester, undergraduate computer science students who use an AI coding assistant, such as GitHub Copilot, on at least three introductory programming assignments will complete those assignments in less time than students who skip such tools, but will score lower on a follow-up assessment testing their understanding of the underlying concepts without AI assistance.</w:t>
       </w:r>
     </w:p>
     <w:p>
@@ -176,7 +176,7 @@
           <w:b w:val="0"/>
           <w:sz w:val="24"/>
         </w:rPr>
-        <w:t>It also follows the SMART framework. It's specific, naming the tool, a usage threshold (three assignments), the population, and two measurable outcomes, both of which are easy to record as numbers and compare across groups. Achievability isn't a concern, since this same comparison has already been run in published studies. Relevance isn't either, given how fast intro-level courses are adapting to these tools right now. Time-bound is where the boundary gets set — tying this to one unit or semester keeps it from becoming an open-ended claim about a student's whole academic career.</w:t>
+        <w:t>It also follows SMART. It's specific, naming the tool, a usage threshold (three assignments), the population, and two measurable outcomes, both easy to record as numbers. Achievability isn't a concern, since this comparison has already been run in published studies, and relevance isn't either, given how fast intro-level courses are adapting to these tools. Time-bound is where the boundary gets set — fixing this to one semester keeps it from becoming an open-ended claim about a student's whole academic career.</w:t>
       </w:r>
     </w:p>
     <w:p>
@@ -204,7 +204,7 @@
           <w:b w:val="0"/>
           <w:sz w:val="24"/>
         </w:rPr>
-        <w:t>At the CHI Conference on Human Factors in Computing Systems, Kazemitabaar et al. (2023) put 69 novice learners through a controlled experiment testing how an AI code generator changed task completion and retention a week later. Its credibility comes from the original data behind it and the formal peer review CHI requires, one of the top venues in human-computer interaction. Worth noting honestly: their AI group scored slightly higher, not lower, on retention, though not significantly, so this source complicates the hypothesis as much as it supports it.</w:t>
+        <w:t>At the CHI Conference on Human Factors in Computing Systems, Kazemitabaar et al. (2023) put 69 novice learners, ages 10 to 17 rather than college students, through a controlled experiment testing how an AI code generator changed task completion and retention a week later. Its credibility comes from the original data behind it and the formal peer review CHI requires, one of the top venues in human-computer interaction. Worth noting honestly: their AI group scored slightly higher, not lower, on retention, though not significantly, so this source complicates the hypothesis as much as it supports it.</w:t>
       </w:r>
     </w:p>
     <w:p>
@@ -292,7 +292,7 @@
           <w:b w:val="0"/>
           <w:sz w:val="24"/>
         </w:rPr>
-        <w:t>The fifth source, George's (2024) credible-sources guide on Scribbr, was the actual standard applied above. It lays out checkable criteria, such as authority, peer review, and currency, for telling a trustworthy source apart from one that only looks trustworthy.</w:t>
+        <w:t>The fifth source, Alquran and Banitaan (2026), surveyed 248 students in the same journal on how they perceive learning, trust, and productivity using tools like Copilot, ChatGPT, and DeepSeek. They found no significant difference in perceived learning across beginner, intermediate, and expert programmers, cutting against the idea that skill level changes how much students think they're learning while relying on AI.</w:t>
       </w:r>
     </w:p>
     <w:p>
@@ -320,7 +320,7 @@
           <w:b w:val="0"/>
           <w:sz w:val="24"/>
         </w:rPr>
-        <w:t>None of these five sources were chosen simply because they mention AI or programming; each does real work toward the hypothesis or the process behind it. Three supply original data on programming students specifically, one summarizes the wider landscape through meta-analysis, and one supports how the other four were judged credible in the first place. Together they show existing research leaning toward mixed results rather than a settled answer, and closing that gap is the whole point of testing this hypothesis.</w:t>
+        <w:t>None of these five sources were chosen simply because they mention AI or programming. Kazemitabaar et al., Prather et al., and Alquran and Banitaan supply original data from programming students, Albadarin et al. adds a classroom comparison, and Alanazi et al. summarizes the field through meta-analysis. George (2024) supplied the who-wrote-it, was-it-reviewed, how-current-is-it questions used to vet all five. Together they show existing research leaning toward mixed results, and closing that gap is the whole point of testing this hypothesis.</w:t>
       </w:r>
     </w:p>
     <w:p>
@@ -451,6 +451,63 @@
           <w:i w:val="0"/>
           <w:sz w:val="24"/>
         </w:rPr>
+        <w:t xml:space="preserve">Alquran, H., &amp; Banitaan, S. (2026). Human–AI collaboration in programming education: Student perspectives on LLM-based coding assistants. </w:t>
+      </w:r>
+      <w:r>
+        <w:rPr>
+          <w:rFonts w:ascii="Times New Roman" w:hAnsi="Times New Roman"/>
+          <w:i/>
+          <w:sz w:val="24"/>
+        </w:rPr>
+        <w:t>Computers</w:t>
+      </w:r>
+      <w:r>
+        <w:rPr>
+          <w:rFonts w:ascii="Times New Roman" w:hAnsi="Times New Roman"/>
+          <w:i w:val="0"/>
+          <w:sz w:val="24"/>
+        </w:rPr>
+        <w:t xml:space="preserve">, </w:t>
+      </w:r>
+      <w:r>
+        <w:rPr>
+          <w:rFonts w:ascii="Times New Roman" w:hAnsi="Times New Roman"/>
+          <w:i/>
+          <w:sz w:val="24"/>
+        </w:rPr>
+        <w:t>15</w:t>
+      </w:r>
+      <w:r>
+        <w:rPr>
+          <w:rFonts w:ascii="Times New Roman" w:hAnsi="Times New Roman"/>
+          <w:i w:val="0"/>
+          <w:sz w:val="24"/>
+        </w:rPr>
+        <w:t xml:space="preserve">(3), 154. </w:t>
+      </w:r>
+      <w:hyperlink r:id="rId11">
+        <w:r>
+          <w:rPr>
+            <w:rFonts w:ascii="Times New Roman" w:hAnsi="Times New Roman"/>
+            <w:sz w:val="24"/>
+            <w:color w:val="0563C1"/>
+            <w:u w:val="single"/>
+          </w:rPr>
+          <w:t>https://doi.org/10.3390/computers15030154</w:t>
+        </w:r>
+      </w:hyperlink>
+    </w:p>
+    <w:p>
+      <w:pPr>
+        <w:spacing w:line="480" w:lineRule="auto" w:after="0"/>
+        <w:ind w:left="720" w:hanging="720"/>
+      </w:pPr>
+      <w:r>
+        <w:rPr>
+          <w:rFonts w:ascii="Times New Roman" w:hAnsi="Times New Roman"/>
+          <w:i w:val="0"/>
+          <w:sz w:val="24"/>
+        </w:rPr>
         <w:t xml:space="preserve">George, T. (2024, May 9). </w:t>
       </w:r>
       <w:r>
@@ -469,7 +526,7 @@
         </w:rPr>
         <w:t xml:space="preserve">. Scribbr. </w:t>
       </w:r>
-      <w:hyperlink r:id="rId11">
+      <w:hyperlink r:id="rId12">
         <w:r>
           <w:rPr>
             <w:rFonts w:ascii="Times New Roman" w:hAnsi="Times New Roman"/>
@@ -510,7 +567,7 @@
         </w:rPr>
         <w:t xml:space="preserve"> (pp. 1–23). Association for Computing Machinery. </w:t>
       </w:r>
-      <w:hyperlink r:id="rId12">
+      <w:hyperlink r:id="rId13">
         <w:r>
           <w:rPr>
             <w:rFonts w:ascii="Times New Roman" w:hAnsi="Times New Roman"/>
@@ -567,7 +624,7 @@
         </w:rPr>
         <w:t xml:space="preserve">(1), 1–31. </w:t>
       </w:r>
-      <w:hyperlink r:id="rId13">
+      <w:hyperlink r:id="rId14">
         <w:r>
           <w:rPr>
             <w:rFonts w:ascii="Times New Roman" w:hAnsi="Times New Roman"/>
@@ -608,7 +665,7 @@
         </w:rPr>
         <w:t xml:space="preserve"> (5th ed.). GALILEO Open Learning Materials. </w:t>
       </w:r>
-      <w:hyperlink r:id="rId14">
+      <w:hyperlink r:id="rId15">
         <w:r>
           <w:rPr>
             <w:rFonts w:ascii="Times New Roman" w:hAnsi="Times New Roman"/>

</xml_diff>